<commit_message>
Document the market-feature exclusion with per-fold evidence
Records that raw and four stationary transforms of market_index were
tested and none beat exclusion, and explains the regime-reversal reason:
the feature wins early folds and loses the late ones closest to the
Nov-Dec prediction window.

Co-Authored-By: Claude Opus 5 <noreply@anthropic.com>
</commit_message>
<xml_diff>
--- a/outputs/report.docx
+++ b/outputs/report.docx
@@ -691,7 +691,22 @@
     </w:p>
     <w:p>
       <w:r>
-        <w:t>Market features (market_index, quote_signal) did not improve time-based CV (lgb_full vs lgb_no_market), so the final model excludes them. This also lets one model serve both the 12,000 validation loads and the December chart, where those features do not exist. The raw-label RMSE is dominated by the corrupted labels, which no model can predict.</w:t>
+        <w:t>Market features (market_index, quote_signal) did not improve time-based CV, so the final model excludes them. I tested them raw (3.06% MAPE) and as four stationary transforms - deviation from the daily mean, level relative to a trailing 28-day mean, and 7d/28d momentum - and none beat the 2.83% of the model without them; the best variant reached 2.95%.</w:t>
+      </w:r>
+    </w:p>
+    <w:p>
+      <w:r>
+        <w:t>The per-fold pattern explains why. Raw market features win the early folds (2.84% vs 6.03% on June) and lose the late ones (4.62% vs 1.91% on September). That tracks the market regime: market_index climbs from 0.91 in January to 1.30 in May, then reverses and falls to 0.87 by September. While the trend continues the feature helps, but gradient-boosted trees cannot extrapolate beyond their trained range, so when the regime reverses the model is confidently wrong. The signal is real but unstable, and the instability costs more than the signal earns.</w:t>
+      </w:r>
+    </w:p>
+    <w:p>
+      <w:r>
+        <w:t>The decisive folds are September and October, the closest analogues to the Nov-Dec prediction window, where excluding market features wins clearly (1.91% and 1.75% against 4.62% and 3.18%). market_index is also flat at roughly 0.92-0.95 across November and December, essentially unchanged from October, so there is no regime shift for a market feature to capture. The known failure mode is a holdout that spans a regime break, as June does.</w:t>
+      </w:r>
+    </w:p>
+    <w:p>
+      <w:r>
+        <w:t>Excluding these features also lets one model serve both the 12,000 validation loads and the December chart, where they do not exist. The raw-label RMSE is dominated by the corrupted labels, which no model can predict.</w:t>
       </w:r>
     </w:p>
     <w:p>

</xml_diff>